<commit_message>
PCA only one DS seems to work, with upload included.
</commit_message>
<xml_diff>
--- a/ML_Weather_Prediction/ML_Weather.docx
+++ b/ML_Weather_Prediction/ML_Weather.docx
@@ -260,8 +260,6 @@
       </w:r>
       <w:r>
         <w:tab/>
-      </w:r>
-      <w:r>
         <w:t>Regression Framework + Linear Regression + Gradient Descent</w:t>
       </w:r>
     </w:p>
@@ -316,6 +314,177 @@
       </w:r>
     </w:p>
     <w:p/>
+    <w:p/>
+    <w:p>
+      <w:r>
+        <w:t>2025-11-14 15:48:53 From Gustavo Torres Guerrero to Everyone:</w:t>
+      </w:r>
+    </w:p>
+    <w:p>
+      <w:r>
+        <w:tab/>
+        <w:t>pca = PCA()</w:t>
+      </w:r>
+    </w:p>
+    <w:p>
+      <w:r>
+        <w:tab/>
+        <w:t>pca.fit(X) # o X_std si lo tienes estandarizado</w:t>
+      </w:r>
+    </w:p>
+    <w:p>
+      <w:r>
+        <w:lastRenderedPageBreak/>
+        <w:tab/>
+      </w:r>
+    </w:p>
+    <w:p>
+      <w:r>
+        <w:tab/>
+        <w:t>explained_var = pca.explained_variance_ratio_</w:t>
+      </w:r>
+    </w:p>
+    <w:p>
+      <w:r>
+        <w:tab/>
+        <w:t>cumulative_var = np.cumsum(explained_var)</w:t>
+      </w:r>
+    </w:p>
+    <w:p>
+      <w:r>
+        <w:tab/>
+      </w:r>
+    </w:p>
+    <w:p>
+      <w:r>
+        <w:t>2025-11-14 15:51:15 From Gustavo Torres Guerrero to Everyone:</w:t>
+      </w:r>
+    </w:p>
+    <w:p>
+      <w:r>
+        <w:tab/>
+        <w:t>pca = PCA()</w:t>
+      </w:r>
+    </w:p>
+    <w:p>
+      <w:r>
+        <w:tab/>
+        <w:t>pca.fit(X) # o X_std si lo tienes estandarizado</w:t>
+      </w:r>
+    </w:p>
+    <w:p>
+      <w:r>
+        <w:tab/>
+      </w:r>
+    </w:p>
+    <w:p>
+      <w:r>
+        <w:tab/>
+        <w:t>explained_var = pca.explained_variance_ratio_</w:t>
+      </w:r>
+    </w:p>
+    <w:p>
+      <w:r>
+        <w:tab/>
+        <w:t>cumulative_var = np.cumsum(explained_var)</w:t>
+      </w:r>
+    </w:p>
+    <w:p>
+      <w:r>
+        <w:tab/>
+      </w:r>
+    </w:p>
+    <w:p>
+      <w:r>
+        <w:tab/>
+        <w:t>plt.figure(figsize=(8,5))</w:t>
+      </w:r>
+    </w:p>
+    <w:p>
+      <w:r>
+        <w:tab/>
+      </w:r>
+    </w:p>
+    <w:p>
+      <w:r>
+        <w:tab/>
+        <w:t>plt.plot(explained_var, marker='o', label='Varianza explicada')</w:t>
+      </w:r>
+    </w:p>
+    <w:p>
+      <w:r>
+        <w:tab/>
+        <w:t>plt.plot(cumulative_var, marker='s', label='Varianza acumulada')</w:t>
+      </w:r>
+    </w:p>
+    <w:p>
+      <w:r>
+        <w:tab/>
+      </w:r>
+    </w:p>
+    <w:p>
+      <w:r>
+        <w:tab/>
+        <w:t>plt.title('Varianza explicada y acumulada en PCA')</w:t>
+      </w:r>
+    </w:p>
+    <w:p>
+      <w:r>
+        <w:tab/>
+        <w:t>plt.xlabel('Número de componentes')</w:t>
+      </w:r>
+    </w:p>
+    <w:p>
+      <w:r>
+        <w:tab/>
+        <w:t>plt.ylabel('Proporción de varianza')</w:t>
+      </w:r>
+    </w:p>
+    <w:p>
+      <w:r>
+        <w:tab/>
+        <w:t>plt.grid(True)</w:t>
+      </w:r>
+    </w:p>
+    <w:p>
+      <w:r>
+        <w:tab/>
+        <w:t>plt.legend()</w:t>
+      </w:r>
+    </w:p>
+    <w:p>
+      <w:r>
+        <w:tab/>
+        <w:t>plt.tight_layout()</w:t>
+      </w:r>
+    </w:p>
+    <w:p>
+      <w:r>
+        <w:tab/>
+        <w:t>plt.show()</w:t>
+      </w:r>
+    </w:p>
+    <w:p>
+      <w:r>
+        <w:tab/>
+      </w:r>
+    </w:p>
+    <w:p>
+      <w:r>
+        <w:t>2025-11-14 16:12:51 From Gustavo Torres Guerrero to Everyone:</w:t>
+      </w:r>
+    </w:p>
+    <w:p>
+      <w:r>
+        <w:tab/>
+        <w:t>https://medium.com/%40axelazara6/why-we-need-encoding-cyclical-features-79ecc3531232</w:t>
+      </w:r>
+    </w:p>
+    <w:p>
+      <w:r>
+        <w:tab/>
+      </w:r>
+    </w:p>
     <w:sectPr>
       <w:pgSz w:w="11906" w:h="16838"/>
       <w:pgMar w:top="1440" w:right="1440" w:bottom="1440" w:left="1440" w:header="708" w:footer="708" w:gutter="0"/>

</xml_diff>

<commit_message>
Added last week's documents & other stuff and updated older documents
</commit_message>
<xml_diff>
--- a/ML_Weather_Prediction/ML_Weather.docx
+++ b/ML_Weather_Prediction/ML_Weather.docx
@@ -10,10 +10,11 @@
     <w:p/>
     <w:p>
       <w:r>
-        <w:t>En Suiza, hablar del tiempo es prácticamente un deporte nacional, ¡y con razón! Cambia muy rápido.</w:t>
-      </w:r>
-    </w:p>
-    <w:p>
+        <w:t>En Suiza, hablar del tiempo es prácticamente un deporte nacional</w:t>
+      </w:r>
+      <w:r>
+        <w:t xml:space="preserve">. </w:t>
+      </w:r>
       <w:r>
         <w:t>Tu tarea consiste en utilizar datos de 10 estaciones meteorológicas distribuidas por el país para predecir la temperatura en Berna.</w:t>
       </w:r>
@@ -57,34 +58,10 @@
     <w:p/>
     <w:p>
       <w:r>
-        <w:t>La competencia está alojada en Kaggle:</w:t>
-      </w:r>
-    </w:p>
-    <w:p>
-      <w:r>
-        <w:t>[https://www.kaggle.com/competitions/s-403011-ml-unige-weather-prediction](https://www.kaggle.com/competitions/s-403011-ml-unige-weather-prediction)</w:t>
-      </w:r>
-    </w:p>
-    <w:p/>
-    <w:p>
-      <w:r>
-        <w:t>Para participar, debes:</w:t>
-      </w:r>
-    </w:p>
-    <w:p/>
-    <w:p>
-      <w:r>
-        <w:t>1. Crear una cuenta en [https://www.kaggle.com/](https://www.kaggle.com/) utilizando un “Display name” que te identifique (por ejemplo, tu apellido). Una vez conectado, podrás unirte a la competencia mediante el siguiente enlace:</w:t>
-      </w:r>
-    </w:p>
-    <w:p>
-      <w:r>
-        <w:t xml:space="preserve">   [https://www.kaggle.com/t/1b3787cc58b34360b9c6152b7650f992](https://www.kaggle.com/t/1b3787cc58b34360b9c6152b7650f992)</w:t>
-      </w:r>
-    </w:p>
-    <w:p>
-      <w:r>
-        <w:t xml:space="preserve">   *Por favor, no compartas este enlace fuera del curso.*</w:t>
+        <w:t>La competencia está alojada en Kaggle</w:t>
+      </w:r>
+      <w:r>
+        <w:t>.</w:t>
       </w:r>
     </w:p>
     <w:p/>
@@ -96,7 +73,13 @@
     <w:p/>
     <w:p>
       <w:r>
-        <w:t>La competencia termina el **19 de diciembre de 2025 a las 23:59**.</w:t>
+        <w:t>La competencia termina el **</w:t>
+      </w:r>
+      <w:r>
+        <w:t>22</w:t>
+      </w:r>
+      <w:r>
+        <w:t xml:space="preserve"> de diciembre de 2025 a las 23:59**.</w:t>
       </w:r>
     </w:p>
     <w:p/>
@@ -113,7 +96,11 @@
     </w:p>
     <w:p>
       <w:r>
-        <w:t>* **Private Leaderboard (tabla privada):** antes del cierre de la competencia, cada equipo debe seleccionar una de sus predicciones para la evaluación final. Tras el cierre, se evaluará esa predicción sobre el 70 % restante de los datos de prueba. Esta tabla determina la clasificación final y los ganadores.</w:t>
+        <w:t xml:space="preserve">* **Private Leaderboard (tabla privada):** antes del cierre de la competencia, cada equipo debe seleccionar una de sus predicciones para la evaluación final. Tras el cierre, </w:t>
+      </w:r>
+      <w:r>
+        <w:lastRenderedPageBreak/>
+        <w:t>se evaluará esa predicción sobre el 70 % restante de los datos de prueba. Esta tabla determina la clasificación final y los ganadores.</w:t>
       </w:r>
     </w:p>
     <w:p/>
@@ -131,7 +118,7 @@
     <w:p/>
     <w:p>
       <w:r>
-        <w:t>1. La participación es en **equipos de tres estudiantes**. Un miembro del equipo debe enviar un correo, antes del **17 de noviembre de 2025**, a **[christophe.valvason@unige.ch](mailto:christophe.valvason@unige.ch)**, indicando los nombres de los miembros y el nombre del equipo (que debe coincidir con el de Kaggle).</w:t>
+        <w:t xml:space="preserve">1. La participación es en **equipos de tres estudiantes**. Un miembro del equipo debe enviar un correo, antes del **17 de noviembre de 2025**, </w:t>
       </w:r>
     </w:p>
     <w:p>
@@ -190,31 +177,31 @@
     <w:p/>
     <w:p>
       <w:r>
+        <w:t>1. **El código en Python:** bien estructurado y documentado, entregado como un *notebook* de Jupyter (IPython). Debe contener el código correspondiente a la predicción final enviada a Kaggle y generar exactamente el mismo archivo CSV. El código debe ser completamente reproducible.</w:t>
+      </w:r>
+    </w:p>
+    <w:p/>
+    <w:p>
+      <w:r>
+        <w:t>2. **Un informe:** que explique cómo se abordó el problema y qué métodos se utilizaron, acompañado de gráficos relevantes y de buena calidad. El informe puede redactarse en **LaTeX o Word** (se proporcionará una plantilla LaTeX). La extensión recomendada es de **15 a 20 páginas**.</w:t>
+      </w:r>
+    </w:p>
+    <w:p/>
+    <w:p>
+      <w:r>
+        <w:t>Ambos archivos deben subirse a Moodle (solo uno por equipo), incluyendo claramente los nombres de los miembros y el nombre del equipo de Kaggle.</w:t>
+      </w:r>
+    </w:p>
+    <w:p/>
+    <w:p>
+      <w:r>
+        <w:t>El informe debe describir en detalle el conjunto de datos y el enfoque seguido. Se sugiere la siguiente estructura:</w:t>
+      </w:r>
+    </w:p>
+    <w:p/>
+    <w:p>
+      <w:r>
         <w:lastRenderedPageBreak/>
-        <w:t>1. **El código en Python:** bien estructurado y documentado, entregado como un *notebook* de Jupyter (IPython). Debe contener el código correspondiente a la predicción final enviada a Kaggle y generar exactamente el mismo archivo CSV. El código debe ser completamente reproducible.</w:t>
-      </w:r>
-    </w:p>
-    <w:p/>
-    <w:p>
-      <w:r>
-        <w:t>2. **Un informe:** que explique cómo se abordó el problema y qué métodos se utilizaron, acompañado de gráficos relevantes y de buena calidad. El informe puede redactarse en **LaTeX o Word** (se proporcionará una plantilla LaTeX). La extensión recomendada es de **15 a 20 páginas**.</w:t>
-      </w:r>
-    </w:p>
-    <w:p/>
-    <w:p>
-      <w:r>
-        <w:t>Ambos archivos deben subirse a Moodle (solo uno por equipo), incluyendo claramente los nombres de los miembros y el nombre del equipo de Kaggle.</w:t>
-      </w:r>
-    </w:p>
-    <w:p/>
-    <w:p>
-      <w:r>
-        <w:t>El informe debe describir en detalle el conjunto de datos y el enfoque seguido. Se sugiere la siguiente estructura:</w:t>
-      </w:r>
-    </w:p>
-    <w:p/>
-    <w:p>
-      <w:r>
         <w:t>* Introducción: descripción del conjunto de datos, problema principal y desafíos del aprendizaje automático con datos temporales.</w:t>
       </w:r>
     </w:p>
@@ -315,176 +302,6 @@
     </w:p>
     <w:p/>
     <w:p/>
-    <w:p>
-      <w:r>
-        <w:t>2025-11-14 15:48:53 From Gustavo Torres Guerrero to Everyone:</w:t>
-      </w:r>
-    </w:p>
-    <w:p>
-      <w:r>
-        <w:tab/>
-        <w:t>pca = PCA()</w:t>
-      </w:r>
-    </w:p>
-    <w:p>
-      <w:r>
-        <w:tab/>
-        <w:t>pca.fit(X) # o X_std si lo tienes estandarizado</w:t>
-      </w:r>
-    </w:p>
-    <w:p>
-      <w:r>
-        <w:lastRenderedPageBreak/>
-        <w:tab/>
-      </w:r>
-    </w:p>
-    <w:p>
-      <w:r>
-        <w:tab/>
-        <w:t>explained_var = pca.explained_variance_ratio_</w:t>
-      </w:r>
-    </w:p>
-    <w:p>
-      <w:r>
-        <w:tab/>
-        <w:t>cumulative_var = np.cumsum(explained_var)</w:t>
-      </w:r>
-    </w:p>
-    <w:p>
-      <w:r>
-        <w:tab/>
-      </w:r>
-    </w:p>
-    <w:p>
-      <w:r>
-        <w:t>2025-11-14 15:51:15 From Gustavo Torres Guerrero to Everyone:</w:t>
-      </w:r>
-    </w:p>
-    <w:p>
-      <w:r>
-        <w:tab/>
-        <w:t>pca = PCA()</w:t>
-      </w:r>
-    </w:p>
-    <w:p>
-      <w:r>
-        <w:tab/>
-        <w:t>pca.fit(X) # o X_std si lo tienes estandarizado</w:t>
-      </w:r>
-    </w:p>
-    <w:p>
-      <w:r>
-        <w:tab/>
-      </w:r>
-    </w:p>
-    <w:p>
-      <w:r>
-        <w:tab/>
-        <w:t>explained_var = pca.explained_variance_ratio_</w:t>
-      </w:r>
-    </w:p>
-    <w:p>
-      <w:r>
-        <w:tab/>
-        <w:t>cumulative_var = np.cumsum(explained_var)</w:t>
-      </w:r>
-    </w:p>
-    <w:p>
-      <w:r>
-        <w:tab/>
-      </w:r>
-    </w:p>
-    <w:p>
-      <w:r>
-        <w:tab/>
-        <w:t>plt.figure(figsize=(8,5))</w:t>
-      </w:r>
-    </w:p>
-    <w:p>
-      <w:r>
-        <w:tab/>
-      </w:r>
-    </w:p>
-    <w:p>
-      <w:r>
-        <w:tab/>
-        <w:t>plt.plot(explained_var, marker='o', label='Varianza explicada')</w:t>
-      </w:r>
-    </w:p>
-    <w:p>
-      <w:r>
-        <w:tab/>
-        <w:t>plt.plot(cumulative_var, marker='s', label='Varianza acumulada')</w:t>
-      </w:r>
-    </w:p>
-    <w:p>
-      <w:r>
-        <w:tab/>
-      </w:r>
-    </w:p>
-    <w:p>
-      <w:r>
-        <w:tab/>
-        <w:t>plt.title('Varianza explicada y acumulada en PCA')</w:t>
-      </w:r>
-    </w:p>
-    <w:p>
-      <w:r>
-        <w:tab/>
-        <w:t>plt.xlabel('Número de componentes')</w:t>
-      </w:r>
-    </w:p>
-    <w:p>
-      <w:r>
-        <w:tab/>
-        <w:t>plt.ylabel('Proporción de varianza')</w:t>
-      </w:r>
-    </w:p>
-    <w:p>
-      <w:r>
-        <w:tab/>
-        <w:t>plt.grid(True)</w:t>
-      </w:r>
-    </w:p>
-    <w:p>
-      <w:r>
-        <w:tab/>
-        <w:t>plt.legend()</w:t>
-      </w:r>
-    </w:p>
-    <w:p>
-      <w:r>
-        <w:tab/>
-        <w:t>plt.tight_layout()</w:t>
-      </w:r>
-    </w:p>
-    <w:p>
-      <w:r>
-        <w:tab/>
-        <w:t>plt.show()</w:t>
-      </w:r>
-    </w:p>
-    <w:p>
-      <w:r>
-        <w:tab/>
-      </w:r>
-    </w:p>
-    <w:p>
-      <w:r>
-        <w:t>2025-11-14 16:12:51 From Gustavo Torres Guerrero to Everyone:</w:t>
-      </w:r>
-    </w:p>
-    <w:p>
-      <w:r>
-        <w:tab/>
-        <w:t>https://medium.com/%40axelazara6/why-we-need-encoding-cyclical-features-79ecc3531232</w:t>
-      </w:r>
-    </w:p>
-    <w:p>
-      <w:r>
-        <w:tab/>
-      </w:r>
-    </w:p>
     <w:sectPr>
       <w:pgSz w:w="11906" w:h="16838"/>
       <w:pgMar w:top="1440" w:right="1440" w:bottom="1440" w:left="1440" w:header="708" w:footer="708" w:gutter="0"/>

</xml_diff>